<commit_message>
Connecting to the database and moving db configuration to its own module
</commit_message>
<xml_diff>
--- a/fullstack.docx
+++ b/fullstack.docx
@@ -8,15 +8,28 @@
           <w:lang w:val="en-GB"/>
         </w:rPr>
       </w:pPr>
-      <w:hyperlink r:id="rId4" w:history="1">
-        <w:r>
-          <w:rPr>
-            <w:rStyle w:val="Hyperlink"/>
-            <w:lang w:val="en-GB"/>
-          </w:rPr>
-          <w:t>fullstack-hy2020/part3-notes-backend</w:t>
-        </w:r>
-      </w:hyperlink>
+      <w:r>
+        <w:fldChar w:fldCharType="begin"/>
+      </w:r>
+      <w:r>
+        <w:rPr>
+          <w:lang w:val="en-GB"/>
+        </w:rPr>
+        <w:instrText>HYPERLINK "https://github.com/fullstack-hy2020/part3-notes-backend/tree/part3-1"</w:instrText>
+      </w:r>
+      <w:r>
+        <w:fldChar w:fldCharType="separate"/>
+      </w:r>
+      <w:r>
+        <w:rPr>
+          <w:rStyle w:val="Hyperlink"/>
+          <w:lang w:val="en-GB"/>
+        </w:rPr>
+        <w:t>fullstack-hy2020/part3-notes-backend</w:t>
+      </w:r>
+      <w:r>
+        <w:fldChar w:fldCharType="end"/>
+      </w:r>
       <w:r>
         <w:rPr>
           <w:lang w:val="en-GB"/>
@@ -36,7 +49,7 @@
           <w:lang w:val="en-GB"/>
         </w:rPr>
       </w:pPr>
-      <w:hyperlink r:id="rId5" w:history="1">
+      <w:hyperlink r:id="rId4" w:history="1">
         <w:r>
           <w:rPr>
             <w:rStyle w:val="Hyperlink"/>
@@ -52,11 +65,19 @@
           <w:lang w:val="en-GB"/>
         </w:rPr>
       </w:pPr>
-      <w:r>
-        <w:rPr>
-          <w:lang w:val="en-GB"/>
-        </w:rPr>
-        <w:t>Github Configured =&gt; After making commits via GUI via VS Code, type git push</w:t>
+      <w:proofErr w:type="spellStart"/>
+      <w:r>
+        <w:rPr>
+          <w:lang w:val="en-GB"/>
+        </w:rPr>
+        <w:t>Github</w:t>
+      </w:r>
+      <w:proofErr w:type="spellEnd"/>
+      <w:r>
+        <w:rPr>
+          <w:lang w:val="en-GB"/>
+        </w:rPr>
+        <w:t xml:space="preserve"> Configured =&gt; After making commits via GUI via VS Code, type git push</w:t>
       </w:r>
     </w:p>
     <w:p>
@@ -65,12 +86,42 @@
           <w:lang w:val="en-GB"/>
         </w:rPr>
       </w:pPr>
-      <w:r>
-        <w:rPr>
-          <w:lang w:val="en-GB"/>
-        </w:rPr>
-        <w:t>Github Pincode (1012) / Nickname: Deresaanne</w:t>
-      </w:r>
+      <w:proofErr w:type="spellStart"/>
+      <w:r>
+        <w:rPr>
+          <w:lang w:val="en-GB"/>
+        </w:rPr>
+        <w:t>Github</w:t>
+      </w:r>
+      <w:proofErr w:type="spellEnd"/>
+      <w:r>
+        <w:rPr>
+          <w:lang w:val="en-GB"/>
+        </w:rPr>
+        <w:t xml:space="preserve"> </w:t>
+      </w:r>
+      <w:proofErr w:type="spellStart"/>
+      <w:r>
+        <w:rPr>
+          <w:lang w:val="en-GB"/>
+        </w:rPr>
+        <w:t>Pincode</w:t>
+      </w:r>
+      <w:proofErr w:type="spellEnd"/>
+      <w:r>
+        <w:rPr>
+          <w:lang w:val="en-GB"/>
+        </w:rPr>
+        <w:t xml:space="preserve"> (1012) / Nickname: </w:t>
+      </w:r>
+      <w:proofErr w:type="spellStart"/>
+      <w:r>
+        <w:rPr>
+          <w:lang w:val="en-GB"/>
+        </w:rPr>
+        <w:t>Deresaanne</w:t>
+      </w:r>
+      <w:proofErr w:type="spellEnd"/>
     </w:p>
     <w:p>
       <w:pPr>
@@ -82,7 +133,21 @@
         <w:rPr>
           <w:lang w:val="en-GB"/>
         </w:rPr>
-        <w:t>MongoDB: Username (Deresaanne), Password (</w:t>
+        <w:t>MongoDB: Username (</w:t>
+      </w:r>
+      <w:proofErr w:type="spellStart"/>
+      <w:r>
+        <w:rPr>
+          <w:lang w:val="en-GB"/>
+        </w:rPr>
+        <w:t>Deresaanne</w:t>
+      </w:r>
+      <w:proofErr w:type="spellEnd"/>
+      <w:r>
+        <w:rPr>
+          <w:lang w:val="en-GB"/>
+        </w:rPr>
+        <w:t>), Password (</w:t>
       </w:r>
       <w:r>
         <w:rPr>
@@ -103,7 +168,7 @@
           <w:lang w:val="en-GB"/>
         </w:rPr>
       </w:pPr>
-      <w:hyperlink r:id="rId6" w:history="1">
+      <w:hyperlink r:id="rId5" w:history="1">
         <w:r>
           <w:rPr>
             <w:rStyle w:val="Hyperlink"/>
@@ -119,7 +184,7 @@
           <w:lang w:val="en-GB"/>
         </w:rPr>
       </w:pPr>
-      <w:hyperlink r:id="rId7" w:history="1">
+      <w:hyperlink r:id="rId6" w:history="1">
         <w:r>
           <w:rPr>
             <w:rStyle w:val="Hyperlink"/>
@@ -139,8 +204,52 @@
         <w:rPr>
           <w:lang w:val="en-GB"/>
         </w:rPr>
-        <w:t>3-4 : Ch 3.c</w:t>
-      </w:r>
+        <w:t>3-</w:t>
+      </w:r>
+      <w:proofErr w:type="gramStart"/>
+      <w:r>
+        <w:rPr>
+          <w:lang w:val="en-GB"/>
+        </w:rPr>
+        <w:t>4 :</w:t>
+      </w:r>
+      <w:proofErr w:type="gramEnd"/>
+      <w:r>
+        <w:rPr>
+          <w:lang w:val="en-GB"/>
+        </w:rPr>
+        <w:t xml:space="preserve"> Ch 3.c</w:t>
+      </w:r>
+    </w:p>
+    <w:p>
+      <w:pPr>
+        <w:rPr>
+          <w:lang w:val="en-GB"/>
+        </w:rPr>
+      </w:pPr>
+      <w:proofErr w:type="spellStart"/>
+      <w:r>
+        <w:rPr>
+          <w:lang w:val="en-GB"/>
+        </w:rPr>
+        <w:t>Ultrahack</w:t>
+      </w:r>
+      <w:proofErr w:type="spellEnd"/>
+      <w:r>
+        <w:rPr>
+          <w:lang w:val="en-GB"/>
+        </w:rPr>
+        <w:t xml:space="preserve">: </w:t>
+      </w:r>
+      <w:hyperlink r:id="rId7" w:history="1">
+        <w:r>
+          <w:rPr>
+            <w:rStyle w:val="Hyperlink"/>
+            <w:lang w:val="en-GB"/>
+          </w:rPr>
+          <w:t>Quantum x Finance Hackathon</w:t>
+        </w:r>
+      </w:hyperlink>
     </w:p>
     <w:sectPr>
       <w:pgSz w:w="11906" w:h="16838"/>
@@ -755,7 +864,6 @@
   <w:style w:type="character" w:default="1" w:styleId="DefaultParagraphFont">
     <w:name w:val="Default Paragraph Font"/>
     <w:uiPriority w:val="1"/>
-    <w:semiHidden/>
     <w:unhideWhenUsed/>
   </w:style>
   <w:style w:type="table" w:default="1" w:styleId="TableNormal">

</xml_diff>